<commit_message>
ATR for model 2
</commit_message>
<xml_diff>
--- a/OFHcrosssectional_plan.docx
+++ b/OFHcrosssectional_plan.docx
@@ -925,20 +925,20 @@
         <w:spacing w:before="0" w:beforeAutospacing="0" w:after="0" w:afterAutospacing="0"/>
         <w:rPr>
           <w:rFonts w:asciiTheme="minorHAnsi" w:hAnsiTheme="minorHAnsi" w:cstheme="minorHAnsi"/>
-          <w:color w:val="0A0A0A"/>
-        </w:rPr>
-      </w:pPr>
-      <w:r>
-        <w:rPr>
-          <w:rFonts w:asciiTheme="minorHAnsi" w:hAnsiTheme="minorHAnsi" w:cstheme="minorHAnsi"/>
-          <w:color w:val="0A0A0A"/>
+          <w:color w:val="FF0000"/>
+        </w:rPr>
+      </w:pPr>
+      <w:r>
+        <w:rPr>
+          <w:rFonts w:asciiTheme="minorHAnsi" w:hAnsiTheme="minorHAnsi" w:cstheme="minorHAnsi"/>
+          <w:color w:val="FF0000"/>
         </w:rPr>
         <w:t xml:space="preserve">asthma preventer inhaler (containing steroid medicine), </w:t>
       </w:r>
       <w:r>
         <w:rPr>
           <w:rFonts w:asciiTheme="minorHAnsi" w:hAnsiTheme="minorHAnsi" w:cstheme="minorHAnsi"/>
-          <w:color w:val="0A0A0A"/>
+          <w:color w:val="FF0000"/>
         </w:rPr>
         <w:t>71836</w:t>
       </w:r>
@@ -953,23 +953,25 @@
         <w:spacing w:before="0" w:beforeAutospacing="0" w:after="0" w:afterAutospacing="0"/>
         <w:rPr>
           <w:rFonts w:asciiTheme="minorHAnsi" w:hAnsiTheme="minorHAnsi" w:cstheme="minorHAnsi"/>
-          <w:color w:val="0A0A0A"/>
-        </w:rPr>
-      </w:pPr>
-      <w:r>
-        <w:rPr>
-          <w:rFonts w:asciiTheme="minorHAnsi" w:hAnsiTheme="minorHAnsi" w:cstheme="minorHAnsi"/>
-          <w:color w:val="0A0A0A"/>
+          <w:color w:val="FF0000"/>
+        </w:rPr>
+      </w:pPr>
+      <w:r>
+        <w:rPr>
+          <w:rFonts w:asciiTheme="minorHAnsi" w:hAnsiTheme="minorHAnsi" w:cstheme="minorHAnsi"/>
+          <w:color w:val="FF0000"/>
         </w:rPr>
         <w:t xml:space="preserve">asthma combination inhaler, </w:t>
       </w:r>
       <w:r>
         <w:rPr>
           <w:rFonts w:asciiTheme="minorHAnsi" w:hAnsiTheme="minorHAnsi" w:cstheme="minorHAnsi"/>
-          <w:color w:val="0A0A0A"/>
+          <w:color w:val="FF0000"/>
         </w:rPr>
         <w:t>20759</w:t>
       </w:r>
+      <w:bookmarkStart w:id="0" w:name="_GoBack"/>
+      <w:bookmarkEnd w:id="0"/>
     </w:p>
     <w:p>
       <w:pPr>
@@ -1009,13 +1011,13 @@
         <w:spacing w:before="0" w:beforeAutospacing="0" w:after="0" w:afterAutospacing="0"/>
         <w:rPr>
           <w:rFonts w:asciiTheme="minorHAnsi" w:hAnsiTheme="minorHAnsi" w:cstheme="minorHAnsi"/>
-          <w:color w:val="0A0A0A"/>
-        </w:rPr>
-      </w:pPr>
-      <w:r>
-        <w:rPr>
-          <w:rFonts w:asciiTheme="minorHAnsi" w:hAnsiTheme="minorHAnsi" w:cstheme="minorHAnsi"/>
-          <w:color w:val="0A0A0A"/>
+          <w:color w:val="FF0000"/>
+        </w:rPr>
+      </w:pPr>
+      <w:r>
+        <w:rPr>
+          <w:rFonts w:asciiTheme="minorHAnsi" w:hAnsiTheme="minorHAnsi" w:cstheme="minorHAnsi"/>
+          <w:color w:val="FF0000"/>
         </w:rPr>
         <w:t xml:space="preserve">leukotriene receptor antagonist (LTRAs) tablets (e.g. </w:t>
       </w:r>
@@ -1023,7 +1025,7 @@
       <w:r>
         <w:rPr>
           <w:rFonts w:asciiTheme="minorHAnsi" w:hAnsiTheme="minorHAnsi" w:cstheme="minorHAnsi"/>
-          <w:color w:val="0A0A0A"/>
+          <w:color w:val="FF0000"/>
         </w:rPr>
         <w:t>Montelukast</w:t>
       </w:r>
@@ -1031,14 +1033,14 @@
       <w:r>
         <w:rPr>
           <w:rFonts w:asciiTheme="minorHAnsi" w:hAnsiTheme="minorHAnsi" w:cstheme="minorHAnsi"/>
-          <w:color w:val="0A0A0A"/>
+          <w:color w:val="FF0000"/>
         </w:rPr>
         <w:t>),</w:t>
       </w:r>
       <w:r>
         <w:rPr>
           <w:rFonts w:asciiTheme="minorHAnsi" w:hAnsiTheme="minorHAnsi" w:cstheme="minorHAnsi"/>
-          <w:color w:val="0A0A0A"/>
+          <w:color w:val="FF0000"/>
         </w:rPr>
         <w:t xml:space="preserve"> 7357</w:t>
       </w:r>
@@ -1133,8 +1135,94 @@
         <w:spacing w:before="0" w:beforeAutospacing="0" w:after="0" w:afterAutospacing="0"/>
         <w:rPr>
           <w:rFonts w:asciiTheme="minorHAnsi" w:hAnsiTheme="minorHAnsi" w:cstheme="minorHAnsi"/>
+          <w:color w:val="0A0A0A"/>
+        </w:rPr>
+      </w:pPr>
+    </w:p>
+    <w:p>
+      <w:pPr>
+        <w:pStyle w:val="NormalWeb"/>
+        <w:spacing w:before="0" w:beforeAutospacing="0" w:after="0" w:afterAutospacing="0"/>
+        <w:rPr>
+          <w:rFonts w:asciiTheme="minorHAnsi" w:hAnsiTheme="minorHAnsi" w:cstheme="minorHAnsi"/>
+          <w:color w:val="0A0A0A"/>
+        </w:rPr>
+      </w:pPr>
+      <w:proofErr w:type="gramStart"/>
+      <w:r>
+        <w:rPr>
+          <w:rFonts w:asciiTheme="minorHAnsi" w:hAnsiTheme="minorHAnsi" w:cstheme="minorHAnsi"/>
+          <w:color w:val="0A0A0A"/>
+        </w:rPr>
+        <w:t>Reported asthma and on one of the medications in red?</w:t>
+      </w:r>
+      <w:proofErr w:type="gramEnd"/>
+    </w:p>
+    <w:p>
+      <w:pPr>
+        <w:pStyle w:val="NormalWeb"/>
+        <w:spacing w:before="0" w:beforeAutospacing="0" w:after="0" w:afterAutospacing="0"/>
+        <w:rPr>
+          <w:rFonts w:asciiTheme="minorHAnsi" w:hAnsiTheme="minorHAnsi" w:cstheme="minorHAnsi"/>
+          <w:color w:val="0A0A0A"/>
+        </w:rPr>
+      </w:pPr>
+    </w:p>
+    <w:p>
+      <w:pPr>
+        <w:pStyle w:val="NormalWeb"/>
+        <w:spacing w:before="0" w:beforeAutospacing="0" w:after="0" w:afterAutospacing="0"/>
+        <w:rPr>
+          <w:rFonts w:asciiTheme="minorHAnsi" w:hAnsiTheme="minorHAnsi" w:cstheme="minorHAnsi"/>
+          <w:color w:val="0A0A0A"/>
+        </w:rPr>
+      </w:pPr>
+      <w:r>
+        <w:rPr>
+          <w:rFonts w:asciiTheme="minorHAnsi" w:hAnsiTheme="minorHAnsi" w:cstheme="minorHAnsi"/>
+          <w:color w:val="0A0A0A"/>
+        </w:rPr>
+        <w:t>Overlap between reliever and preventer groups?</w:t>
+      </w:r>
+    </w:p>
+    <w:p>
+      <w:pPr>
+        <w:pStyle w:val="NormalWeb"/>
+        <w:spacing w:before="0" w:beforeAutospacing="0" w:after="0" w:afterAutospacing="0"/>
+        <w:rPr>
+          <w:rFonts w:asciiTheme="minorHAnsi" w:hAnsiTheme="minorHAnsi" w:cstheme="minorHAnsi"/>
+          <w:color w:val="0A0A0A"/>
+        </w:rPr>
+      </w:pPr>
+    </w:p>
+    <w:p>
+      <w:pPr>
+        <w:pStyle w:val="NormalWeb"/>
+        <w:spacing w:before="0" w:beforeAutospacing="0" w:after="0" w:afterAutospacing="0"/>
+        <w:rPr>
+          <w:rFonts w:asciiTheme="minorHAnsi" w:hAnsiTheme="minorHAnsi" w:cstheme="minorHAnsi"/>
+          <w:color w:val="0A0A0A"/>
+        </w:rPr>
+      </w:pPr>
+      <w:proofErr w:type="gramStart"/>
+      <w:r>
+        <w:rPr>
+          <w:rFonts w:asciiTheme="minorHAnsi" w:hAnsiTheme="minorHAnsi" w:cstheme="minorHAnsi"/>
+          <w:color w:val="0A0A0A"/>
+        </w:rPr>
+        <w:t>Table of asthma doctor diagnosis with medication.</w:t>
+      </w:r>
+      <w:proofErr w:type="gramEnd"/>
+    </w:p>
+    <w:p>
+      <w:pPr>
+        <w:pStyle w:val="NormalWeb"/>
+        <w:spacing w:before="0" w:beforeAutospacing="0" w:after="0" w:afterAutospacing="0"/>
+        <w:rPr>
+          <w:rFonts w:asciiTheme="minorHAnsi" w:hAnsiTheme="minorHAnsi" w:cstheme="minorHAnsi"/>
           <w:b/>
           <w:color w:val="0A0A0A"/>
+          <w:u w:val="single"/>
         </w:rPr>
       </w:pPr>
     </w:p>
@@ -1575,6 +1663,7 @@
           <w:rFonts w:asciiTheme="minorHAnsi" w:hAnsiTheme="minorHAnsi" w:cstheme="minorHAnsi"/>
           <w:color w:val="0A0A0A"/>
         </w:rPr>
+        <w:lastRenderedPageBreak/>
         <w:t xml:space="preserve">Prefer not to answer, white (sub cats for </w:t>
       </w:r>
       <w:proofErr w:type="spellStart"/>
@@ -1806,7 +1895,6 @@
           <w:rFonts w:asciiTheme="minorHAnsi" w:hAnsiTheme="minorHAnsi" w:cstheme="minorHAnsi"/>
           <w:color w:val="0A0A0A"/>
         </w:rPr>
-        <w:lastRenderedPageBreak/>
         <w:t>TDI</w:t>
       </w:r>
     </w:p>
@@ -1907,6 +1995,27 @@
       <w:pPr>
         <w:pStyle w:val="NormalWeb"/>
         <w:numPr>
+          <w:ilvl w:val="1"/>
+          <w:numId w:val="2"/>
+        </w:numPr>
+        <w:spacing w:before="0" w:beforeAutospacing="0" w:after="0" w:afterAutospacing="0"/>
+        <w:rPr>
+          <w:rFonts w:asciiTheme="minorHAnsi" w:hAnsiTheme="minorHAnsi" w:cstheme="minorHAnsi"/>
+          <w:color w:val="0A0A0A"/>
+        </w:rPr>
+      </w:pPr>
+      <w:r>
+        <w:rPr>
+          <w:rFonts w:asciiTheme="minorHAnsi" w:hAnsiTheme="minorHAnsi" w:cstheme="minorHAnsi"/>
+          <w:color w:val="0A0A0A"/>
+        </w:rPr>
+        <w:t>Could use household income as an alternative for deprivation</w:t>
+      </w:r>
+    </w:p>
+    <w:p>
+      <w:pPr>
+        <w:pStyle w:val="NormalWeb"/>
+        <w:numPr>
           <w:ilvl w:val="0"/>
           <w:numId w:val="2"/>
         </w:numPr>
@@ -1944,6 +2053,29 @@
         </w:rPr>
         <w:t>UKB: status &amp; daily intake</w:t>
       </w:r>
+      <w:r>
+        <w:rPr>
+          <w:rFonts w:asciiTheme="minorHAnsi" w:hAnsiTheme="minorHAnsi" w:cstheme="minorHAnsi"/>
+          <w:color w:val="0A0A0A"/>
+        </w:rPr>
+        <w:t>. Status is; prefer not to answer, never, previous, current. Intake is; daily</w:t>
+      </w:r>
+      <w:proofErr w:type="gramStart"/>
+      <w:r>
+        <w:rPr>
+          <w:rFonts w:asciiTheme="minorHAnsi" w:hAnsiTheme="minorHAnsi" w:cstheme="minorHAnsi"/>
+          <w:color w:val="0A0A0A"/>
+        </w:rPr>
+        <w:t>,3</w:t>
+      </w:r>
+      <w:proofErr w:type="gramEnd"/>
+      <w:r>
+        <w:rPr>
+          <w:rFonts w:asciiTheme="minorHAnsi" w:hAnsiTheme="minorHAnsi" w:cstheme="minorHAnsi"/>
+          <w:color w:val="0A0A0A"/>
+        </w:rPr>
+        <w:t>-4 times a week, 1 or 2 a week, 1-3 a month, special occasions, never, prefer not to answer.</w:t>
+      </w:r>
     </w:p>
     <w:p>
       <w:pPr>
@@ -2187,7 +2319,23 @@
           <w:rFonts w:asciiTheme="minorHAnsi" w:hAnsiTheme="minorHAnsi" w:cstheme="minorHAnsi"/>
           <w:color w:val="0A0A0A"/>
         </w:rPr>
-        <w:t>Also data on climbing stairs</w:t>
+        <w:t xml:space="preserve">Numeric but with “do not </w:t>
+      </w:r>
+      <w:proofErr w:type="spellStart"/>
+      <w:r>
+        <w:rPr>
+          <w:rFonts w:asciiTheme="minorHAnsi" w:hAnsiTheme="minorHAnsi" w:cstheme="minorHAnsi"/>
+          <w:color w:val="0A0A0A"/>
+        </w:rPr>
+        <w:t>know”,”prefer</w:t>
+      </w:r>
+      <w:proofErr w:type="spellEnd"/>
+      <w:r>
+        <w:rPr>
+          <w:rFonts w:asciiTheme="minorHAnsi" w:hAnsiTheme="minorHAnsi" w:cstheme="minorHAnsi"/>
+          <w:color w:val="0A0A0A"/>
+        </w:rPr>
+        <w:t xml:space="preserve"> not to answer” and “unable to walk”</w:t>
       </w:r>
     </w:p>
     <w:p>
@@ -2208,6 +2356,27 @@
           <w:rFonts w:asciiTheme="minorHAnsi" w:hAnsiTheme="minorHAnsi" w:cstheme="minorHAnsi"/>
           <w:color w:val="0A0A0A"/>
         </w:rPr>
+        <w:t>Also data on climbing stairs</w:t>
+      </w:r>
+    </w:p>
+    <w:p>
+      <w:pPr>
+        <w:pStyle w:val="NormalWeb"/>
+        <w:numPr>
+          <w:ilvl w:val="1"/>
+          <w:numId w:val="2"/>
+        </w:numPr>
+        <w:spacing w:before="0" w:beforeAutospacing="0" w:after="0" w:afterAutospacing="0"/>
+        <w:rPr>
+          <w:rFonts w:asciiTheme="minorHAnsi" w:hAnsiTheme="minorHAnsi" w:cstheme="minorHAnsi"/>
+          <w:color w:val="0A0A0A"/>
+        </w:rPr>
+      </w:pPr>
+      <w:r>
+        <w:rPr>
+          <w:rFonts w:asciiTheme="minorHAnsi" w:hAnsiTheme="minorHAnsi" w:cstheme="minorHAnsi"/>
+          <w:color w:val="0A0A0A"/>
+        </w:rPr>
         <w:t>And type of activity (walking for pleasure, other (swimming, cycling, keep fit, bowling), strenuous sports, light DIY, Heavy DIY)</w:t>
       </w:r>
     </w:p>
@@ -2257,6 +2426,43 @@
       <w:pPr>
         <w:pStyle w:val="NormalWeb"/>
         <w:numPr>
+          <w:ilvl w:val="1"/>
+          <w:numId w:val="2"/>
+        </w:numPr>
+        <w:spacing w:before="0" w:beforeAutospacing="0" w:after="0" w:afterAutospacing="0"/>
+        <w:rPr>
+          <w:rFonts w:asciiTheme="minorHAnsi" w:hAnsiTheme="minorHAnsi" w:cstheme="minorHAnsi"/>
+          <w:color w:val="0A0A0A"/>
+        </w:rPr>
+      </w:pPr>
+      <w:r>
+        <w:rPr>
+          <w:rFonts w:asciiTheme="minorHAnsi" w:hAnsiTheme="minorHAnsi" w:cstheme="minorHAnsi"/>
+          <w:color w:val="0A0A0A"/>
+        </w:rPr>
+        <w:t xml:space="preserve">Numeric but with “do not </w:t>
+      </w:r>
+      <w:proofErr w:type="spellStart"/>
+      <w:r>
+        <w:rPr>
+          <w:rFonts w:asciiTheme="minorHAnsi" w:hAnsiTheme="minorHAnsi" w:cstheme="minorHAnsi"/>
+          <w:color w:val="0A0A0A"/>
+        </w:rPr>
+        <w:t>know”,”prefer</w:t>
+      </w:r>
+      <w:proofErr w:type="spellEnd"/>
+      <w:r>
+        <w:rPr>
+          <w:rFonts w:asciiTheme="minorHAnsi" w:hAnsiTheme="minorHAnsi" w:cstheme="minorHAnsi"/>
+          <w:color w:val="0A0A0A"/>
+        </w:rPr>
+        <w:t xml:space="preserve"> not to answer”</w:t>
+      </w:r>
+    </w:p>
+    <w:p>
+      <w:pPr>
+        <w:pStyle w:val="NormalWeb"/>
+        <w:numPr>
           <w:ilvl w:val="0"/>
           <w:numId w:val="2"/>
         </w:numPr>
@@ -2408,8 +2614,6 @@
         </w:rPr>
         <w:t xml:space="preserve"> </w:t>
       </w:r>
-      <w:bookmarkStart w:id="0" w:name="_GoBack"/>
-      <w:bookmarkEnd w:id="0"/>
     </w:p>
     <w:p>
       <w:pPr>
@@ -2429,23 +2633,22 @@
           <w:rFonts w:asciiTheme="minorHAnsi" w:hAnsiTheme="minorHAnsi" w:cstheme="minorHAnsi"/>
           <w:color w:val="0A0A0A"/>
         </w:rPr>
-        <w:t xml:space="preserve">No job SOC codes in OFH or anything detailed about job type. Only has data on distance to work, manual labour, shift </w:t>
-      </w:r>
-      <w:proofErr w:type="spellStart"/>
-      <w:r>
-        <w:rPr>
-          <w:rFonts w:asciiTheme="minorHAnsi" w:hAnsiTheme="minorHAnsi" w:cstheme="minorHAnsi"/>
-          <w:color w:val="0A0A0A"/>
-        </w:rPr>
-        <w:t>wrok</w:t>
-      </w:r>
-      <w:proofErr w:type="spellEnd"/>
-      <w:r>
-        <w:rPr>
-          <w:rFonts w:asciiTheme="minorHAnsi" w:hAnsiTheme="minorHAnsi" w:cstheme="minorHAnsi"/>
-          <w:color w:val="0A0A0A"/>
-        </w:rPr>
-        <w:t>, transport to/from work, walking or standing most of time, work hours, times a week travelled to work, years in current job</w:t>
+        <w:lastRenderedPageBreak/>
+        <w:t>No job SOC codes in OFH or anything detailed about job type. Only has data on distance to work, manual labour, shift w</w:t>
+      </w:r>
+      <w:r>
+        <w:rPr>
+          <w:rFonts w:asciiTheme="minorHAnsi" w:hAnsiTheme="minorHAnsi" w:cstheme="minorHAnsi"/>
+          <w:color w:val="0A0A0A"/>
+        </w:rPr>
+        <w:t>or</w:t>
+      </w:r>
+      <w:r>
+        <w:rPr>
+          <w:rFonts w:asciiTheme="minorHAnsi" w:hAnsiTheme="minorHAnsi" w:cstheme="minorHAnsi"/>
+          <w:color w:val="0A0A0A"/>
+        </w:rPr>
+        <w:t>k, transport to/from work, walking or standing most of time, work hours, times a week travelled to work, years in current job</w:t>
       </w:r>
     </w:p>
     <w:p>
@@ -2619,7 +2822,6 @@
           <w:rFonts w:asciiTheme="minorHAnsi" w:hAnsiTheme="minorHAnsi" w:cstheme="minorHAnsi"/>
           <w:color w:val="0A0A0A"/>
         </w:rPr>
-        <w:lastRenderedPageBreak/>
         <w:t>Ever used tobacco products (cigs, cigars, e cigs, etc.)</w:t>
       </w:r>
     </w:p>
@@ -3216,6 +3418,7 @@
           <w:rFonts w:asciiTheme="minorHAnsi" w:hAnsiTheme="minorHAnsi" w:cstheme="minorHAnsi"/>
           <w:color w:val="0A0A0A"/>
         </w:rPr>
+        <w:lastRenderedPageBreak/>
         <w:t>LIFESTYLE_OUTDOOR_SUM_HRS_1_1</w:t>
       </w:r>
     </w:p>
@@ -3322,6 +3525,69 @@
           <w:color w:val="0A0A0A"/>
         </w:rPr>
         <w:t>No phone data</w:t>
+      </w:r>
+    </w:p>
+    <w:p>
+      <w:pPr>
+        <w:pStyle w:val="NormalWeb"/>
+        <w:numPr>
+          <w:ilvl w:val="0"/>
+          <w:numId w:val="3"/>
+        </w:numPr>
+        <w:spacing w:before="0" w:beforeAutospacing="0" w:after="0" w:afterAutospacing="0"/>
+        <w:rPr>
+          <w:rFonts w:asciiTheme="minorHAnsi" w:hAnsiTheme="minorHAnsi" w:cstheme="minorHAnsi"/>
+          <w:color w:val="0A0A0A"/>
+        </w:rPr>
+      </w:pPr>
+      <w:r>
+        <w:rPr>
+          <w:rFonts w:asciiTheme="minorHAnsi" w:hAnsiTheme="minorHAnsi" w:cstheme="minorHAnsi"/>
+          <w:color w:val="0A0A0A"/>
+        </w:rPr>
+        <w:t>Household income</w:t>
+      </w:r>
+    </w:p>
+    <w:p>
+      <w:pPr>
+        <w:pStyle w:val="NormalWeb"/>
+        <w:numPr>
+          <w:ilvl w:val="1"/>
+          <w:numId w:val="3"/>
+        </w:numPr>
+        <w:spacing w:before="0" w:beforeAutospacing="0" w:after="0" w:afterAutospacing="0"/>
+        <w:rPr>
+          <w:rFonts w:asciiTheme="minorHAnsi" w:hAnsiTheme="minorHAnsi" w:cstheme="minorHAnsi"/>
+          <w:color w:val="0A0A0A"/>
+        </w:rPr>
+      </w:pPr>
+      <w:r>
+        <w:rPr>
+          <w:rFonts w:asciiTheme="minorHAnsi" w:hAnsiTheme="minorHAnsi" w:cstheme="minorHAnsi"/>
+          <w:color w:val="0A0A0A"/>
+        </w:rPr>
+        <w:t>HOUSING_INCOME_1_1</w:t>
+      </w:r>
+    </w:p>
+    <w:p>
+      <w:pPr>
+        <w:pStyle w:val="NormalWeb"/>
+        <w:numPr>
+          <w:ilvl w:val="1"/>
+          <w:numId w:val="3"/>
+        </w:numPr>
+        <w:spacing w:before="0" w:beforeAutospacing="0" w:after="0" w:afterAutospacing="0"/>
+        <w:rPr>
+          <w:rFonts w:asciiTheme="minorHAnsi" w:hAnsiTheme="minorHAnsi" w:cstheme="minorHAnsi"/>
+          <w:color w:val="0A0A0A"/>
+        </w:rPr>
+      </w:pPr>
+      <w:r>
+        <w:rPr>
+          <w:rFonts w:asciiTheme="minorHAnsi" w:hAnsiTheme="minorHAnsi" w:cstheme="minorHAnsi"/>
+          <w:color w:val="0A0A0A"/>
+        </w:rPr>
+        <w:t>Do not know, prefer not to answer, &lt;£18k, £18k&lt;=x&lt;£31k, £31k&lt;=x&lt;£52k, £52k&lt;=x&lt;=£100k, &gt;£100k</w:t>
       </w:r>
     </w:p>
     <w:p>

</xml_diff>